<commit_message>
Updated project docx file
</commit_message>
<xml_diff>
--- a/Project_report.docx
+++ b/Project_report.docx
@@ -151,8 +151,60 @@
           <w:lang w:eastAsia="en-GB"/>
           <w14:ligatures w14:val="none"/>
         </w:rPr>
+        <w:t xml:space="preserve">Project </w:t>
+      </w:r>
+      <w:r>
+        <w:rPr>
+          <w:rFonts w:ascii="Segoe UI" w:eastAsia="Times New Roman" w:hAnsi="Segoe UI" w:cs="Segoe UI"/>
+          <w:color w:val="000000" w:themeColor="text1"/>
+          <w:kern w:val="0"/>
+          <w:lang w:eastAsia="en-GB"/>
+          <w14:ligatures w14:val="none"/>
+        </w:rPr>
         <w:t>GitHub</w:t>
       </w:r>
+      <w:r>
+        <w:rPr>
+          <w:rFonts w:ascii="Segoe UI" w:eastAsia="Times New Roman" w:hAnsi="Segoe UI" w:cs="Segoe UI"/>
+          <w:color w:val="000000" w:themeColor="text1"/>
+          <w:kern w:val="0"/>
+          <w:lang w:eastAsia="en-GB"/>
+          <w14:ligatures w14:val="none"/>
+        </w:rPr>
+        <w:t xml:space="preserve"> Link: </w:t>
+      </w:r>
+      <w:hyperlink r:id="rId7" w:history="1">
+        <w:r>
+          <w:rPr>
+            <w:rStyle w:val="Hyperlink"/>
+            <w:rFonts w:ascii="Segoe UI" w:eastAsia="Times New Roman" w:hAnsi="Segoe UI" w:cs="Segoe UI"/>
+            <w:kern w:val="0"/>
+            <w:lang w:eastAsia="en-GB"/>
+            <w14:ligatures w14:val="none"/>
+          </w:rPr>
+          <w:t>https://github.com/junejanikku</w:t>
+        </w:r>
+        <w:r>
+          <w:rPr>
+            <w:rStyle w:val="Hyperlink"/>
+            <w:rFonts w:ascii="Segoe UI" w:eastAsia="Times New Roman" w:hAnsi="Segoe UI" w:cs="Segoe UI"/>
+            <w:kern w:val="0"/>
+            <w:lang w:eastAsia="en-GB"/>
+            <w14:ligatures w14:val="none"/>
+          </w:rPr>
+          <w:t>1</w:t>
+        </w:r>
+        <w:r>
+          <w:rPr>
+            <w:rStyle w:val="Hyperlink"/>
+            <w:rFonts w:ascii="Segoe UI" w:eastAsia="Times New Roman" w:hAnsi="Segoe UI" w:cs="Segoe UI"/>
+            <w:kern w:val="0"/>
+            <w:lang w:eastAsia="en-GB"/>
+            <w14:ligatures w14:val="none"/>
+          </w:rPr>
+          <w:t>234/Analysing-OS-Kernel-Vulnerabilities</w:t>
+        </w:r>
+      </w:hyperlink>
     </w:p>
     <w:p>
       <w:pPr>
@@ -785,6 +837,7 @@
       <w:r>
         <w:rPr>
           <w:rFonts w:ascii="Segoe UI" w:eastAsia="Times New Roman" w:hAnsi="Segoe UI" w:cs="Segoe UI"/>
+          <w:noProof/>
           <w:color w:val="000000" w:themeColor="text1"/>
           <w:kern w:val="0"/>
           <w:lang w:eastAsia="en-GB"/>
@@ -806,7 +859,7 @@
                     <pic:cNvPicPr/>
                   </pic:nvPicPr>
                   <pic:blipFill>
-                    <a:blip r:embed="rId7"/>
+                    <a:blip r:embed="rId8"/>
                     <a:stretch>
                       <a:fillRect/>
                     </a:stretch>
@@ -1095,6 +1148,7 @@
       <w:r>
         <w:rPr>
           <w:rFonts w:ascii="Segoe UI" w:eastAsia="Times New Roman" w:hAnsi="Segoe UI" w:cs="Segoe UI"/>
+          <w:noProof/>
           <w:color w:val="000000" w:themeColor="text1"/>
           <w:kern w:val="0"/>
           <w:lang w:eastAsia="en-GB"/>
@@ -1117,7 +1171,7 @@
                     <pic:cNvPicPr/>
                   </pic:nvPicPr>
                   <pic:blipFill>
-                    <a:blip r:embed="rId8"/>
+                    <a:blip r:embed="rId9"/>
                     <a:stretch>
                       <a:fillRect/>
                     </a:stretch>
@@ -1431,6 +1485,7 @@
       <w:r>
         <w:rPr>
           <w:rFonts w:ascii="Segoe UI" w:eastAsia="Times New Roman" w:hAnsi="Segoe UI" w:cs="Segoe UI"/>
+          <w:noProof/>
           <w:color w:val="000000" w:themeColor="text1"/>
           <w:kern w:val="0"/>
           <w:lang w:eastAsia="en-GB"/>
@@ -1452,7 +1507,7 @@
                     <pic:cNvPicPr/>
                   </pic:nvPicPr>
                   <pic:blipFill>
-                    <a:blip r:embed="rId9"/>
+                    <a:blip r:embed="rId10"/>
                     <a:stretch>
                       <a:fillRect/>
                     </a:stretch>
@@ -1764,6 +1819,7 @@
       <w:r>
         <w:rPr>
           <w:rFonts w:ascii="Segoe UI" w:eastAsia="Times New Roman" w:hAnsi="Segoe UI" w:cs="Segoe UI"/>
+          <w:noProof/>
           <w:color w:val="000000" w:themeColor="text1"/>
           <w:kern w:val="0"/>
           <w:lang w:eastAsia="en-GB"/>
@@ -1785,7 +1841,7 @@
                     <pic:cNvPicPr/>
                   </pic:nvPicPr>
                   <pic:blipFill>
-                    <a:blip r:embed="rId10"/>
+                    <a:blip r:embed="rId11"/>
                     <a:stretch>
                       <a:fillRect/>
                     </a:stretch>
@@ -2074,6 +2130,7 @@
       <w:r>
         <w:rPr>
           <w:rFonts w:ascii="Segoe UI" w:eastAsia="Times New Roman" w:hAnsi="Segoe UI" w:cs="Segoe UI"/>
+          <w:noProof/>
           <w:color w:val="000000" w:themeColor="text1"/>
           <w:kern w:val="0"/>
           <w:lang w:eastAsia="en-GB"/>
@@ -2095,7 +2152,7 @@
                     <pic:cNvPicPr/>
                   </pic:nvPicPr>
                   <pic:blipFill>
-                    <a:blip r:embed="rId11"/>
+                    <a:blip r:embed="rId12"/>
                     <a:stretch>
                       <a:fillRect/>
                     </a:stretch>
@@ -3143,6 +3200,7 @@
           <w:rFonts w:ascii="Segoe UI" w:eastAsia="Times New Roman" w:hAnsi="Segoe UI" w:cs="Segoe UI"/>
           <w:b/>
           <w:bCs/>
+          <w:noProof/>
           <w:color w:val="000000" w:themeColor="text1"/>
           <w:kern w:val="0"/>
           <w:sz w:val="36"/>
@@ -3166,7 +3224,7 @@
                     <pic:cNvPicPr/>
                   </pic:nvPicPr>
                   <pic:blipFill>
-                    <a:blip r:embed="rId12"/>
+                    <a:blip r:embed="rId13"/>
                     <a:stretch>
                       <a:fillRect/>
                     </a:stretch>
@@ -3208,6 +3266,7 @@
           <w:rFonts w:ascii="Segoe UI" w:eastAsia="Times New Roman" w:hAnsi="Segoe UI" w:cs="Segoe UI"/>
           <w:b/>
           <w:bCs/>
+          <w:noProof/>
           <w:color w:val="000000" w:themeColor="text1"/>
           <w:kern w:val="0"/>
           <w:sz w:val="36"/>
@@ -3231,7 +3290,7 @@
                     <pic:cNvPicPr/>
                   </pic:nvPicPr>
                   <pic:blipFill>
-                    <a:blip r:embed="rId13"/>
+                    <a:blip r:embed="rId14"/>
                     <a:stretch>
                       <a:fillRect/>
                     </a:stretch>
@@ -5859,6 +5918,41 @@
       <w:bCs/>
     </w:rPr>
   </w:style>
+  <w:style w:type="character" w:styleId="Hyperlink">
+    <w:name w:val="Hyperlink"/>
+    <w:basedOn w:val="DefaultParagraphFont"/>
+    <w:uiPriority w:val="99"/>
+    <w:unhideWhenUsed/>
+    <w:rsid w:val="00810096"/>
+    <w:rPr>
+      <w:color w:val="467886" w:themeColor="hyperlink"/>
+      <w:u w:val="single"/>
+    </w:rPr>
+  </w:style>
+  <w:style w:type="character" w:styleId="UnresolvedMention">
+    <w:name w:val="Unresolved Mention"/>
+    <w:basedOn w:val="DefaultParagraphFont"/>
+    <w:uiPriority w:val="99"/>
+    <w:semiHidden/>
+    <w:unhideWhenUsed/>
+    <w:rsid w:val="00810096"/>
+    <w:rPr>
+      <w:color w:val="605E5C"/>
+      <w:shd w:val="clear" w:color="auto" w:fill="E1DFDD"/>
+    </w:rPr>
+  </w:style>
+  <w:style w:type="character" w:styleId="FollowedHyperlink">
+    <w:name w:val="FollowedHyperlink"/>
+    <w:basedOn w:val="DefaultParagraphFont"/>
+    <w:uiPriority w:val="99"/>
+    <w:semiHidden/>
+    <w:unhideWhenUsed/>
+    <w:rsid w:val="00810096"/>
+    <w:rPr>
+      <w:color w:val="96607D" w:themeColor="followedHyperlink"/>
+      <w:u w:val="single"/>
+    </w:rPr>
+  </w:style>
 </w:styles>
 </file>
 

</xml_diff>